<commit_message>
Updates README.txt for submission
</commit_message>
<xml_diff>
--- a/a_submission-files-v0/Group Coursework Submission Form.docx
+++ b/a_submission-files-v0/Group Coursework Submission Form.docx
@@ -1,6 +1,6 @@
 
 <file path=word/document.xml><?xml version="1.0" encoding="utf-8"?>
-<w:document xmlns:wpc="http://schemas.microsoft.com/office/word/2010/wordprocessingCanvas" xmlns:cx="http://schemas.microsoft.com/office/drawing/2014/chartex" xmlns:cx1="http://schemas.microsoft.com/office/drawing/2015/9/8/chartex" xmlns:cx2="http://schemas.microsoft.com/office/drawing/2015/10/21/chartex" xmlns:cx3="http://schemas.microsoft.com/office/drawing/2016/5/9/chartex" xmlns:cx4="http://schemas.microsoft.com/office/drawing/2016/5/10/chartex" xmlns:cx5="http://schemas.microsoft.com/office/drawing/2016/5/11/chartex" xmlns:cx6="http://schemas.microsoft.com/office/drawing/2016/5/12/chartex" xmlns:cx7="http://schemas.microsoft.com/office/drawing/2016/5/13/chartex" xmlns:cx8="http://schemas.microsoft.com/office/drawing/2016/5/14/chartex" xmlns:mc="http://schemas.openxmlformats.org/markup-compatibility/2006" xmlns:aink="http://schemas.microsoft.com/office/drawing/2016/ink" xmlns:am3d="http://schemas.microsoft.com/office/drawing/2017/model3d" xmlns:o="urn:schemas-microsoft-com:office:office" xmlns:oel="http://schemas.microsoft.com/office/2019/extlst" xmlns:r="http://schemas.openxmlformats.org/officeDocument/2006/relationships" xmlns:m="http://schemas.openxmlformats.org/officeDocument/2006/math" xmlns:v="urn:schemas-microsoft-com:vml" xmlns:wp14="http://schemas.microsoft.com/office/word/2010/wordprocessingDrawing" xmlns:wp="http://schemas.openxmlformats.org/drawingml/2006/wordprocessingDrawing" xmlns:w10="urn:schemas-microsoft-com:office:word" xmlns:w="http://schemas.openxmlformats.org/wordprocessingml/2006/main" xmlns:w14="http://schemas.microsoft.com/office/word/2010/wordml" xmlns:w15="http://schemas.microsoft.com/office/word/2012/wordml" xmlns:w16cex="http://schemas.microsoft.com/office/word/2018/wordml/cex" xmlns:w16cid="http://schemas.microsoft.com/office/word/2016/wordml/cid" xmlns:w16="http://schemas.microsoft.com/office/word/2018/wordml" xmlns:w16du="http://schemas.microsoft.com/office/word/2023/wordml/word16du" xmlns:w16sdtdh="http://schemas.microsoft.com/office/word/2020/wordml/sdtdatahash" xmlns:w16sdtfl="http://schemas.microsoft.com/office/word/2024/wordml/sdtformatlock" xmlns:w16se="http://schemas.microsoft.com/office/word/2015/wordml/symex" xmlns:wpg="http://schemas.microsoft.com/office/word/2010/wordprocessingGroup" xmlns:wpi="http://schemas.microsoft.com/office/word/2010/wordprocessingInk" xmlns:wne="http://schemas.microsoft.com/office/word/2006/wordml" xmlns:wps="http://schemas.microsoft.com/office/word/2010/wordprocessingShape" mc:Ignorable="w14 w15 w16se w16cid w16 w16cex w16sdtdh w16sdtfl w16du wp14">
+<w:document xmlns:wpc="http://schemas.microsoft.com/office/word/2010/wordprocessingCanvas" xmlns:cx="http://schemas.microsoft.com/office/drawing/2014/chartex" xmlns:cx1="http://schemas.microsoft.com/office/drawing/2015/9/8/chartex" xmlns:cx2="http://schemas.microsoft.com/office/drawing/2015/10/21/chartex" xmlns:cx3="http://schemas.microsoft.com/office/drawing/2016/5/9/chartex" xmlns:cx4="http://schemas.microsoft.com/office/drawing/2016/5/10/chartex" xmlns:cx5="http://schemas.microsoft.com/office/drawing/2016/5/11/chartex" xmlns:cx6="http://schemas.microsoft.com/office/drawing/2016/5/12/chartex" xmlns:cx7="http://schemas.microsoft.com/office/drawing/2016/5/13/chartex" xmlns:cx8="http://schemas.microsoft.com/office/drawing/2016/5/14/chartex" xmlns:mc="http://schemas.openxmlformats.org/markup-compatibility/2006" xmlns:m="http://schemas.openxmlformats.org/officeDocument/2006/math" xmlns:aink="http://schemas.microsoft.com/office/drawing/2016/ink" xmlns:am3d="http://schemas.microsoft.com/office/drawing/2017/model3d" xmlns:oel="http://schemas.microsoft.com/office/2019/extlst" xmlns:r="http://schemas.openxmlformats.org/officeDocument/2006/relationships" xmlns:wp14="http://schemas.microsoft.com/office/word/2010/wordprocessingDrawing" xmlns:wp="http://schemas.openxmlformats.org/drawingml/2006/wordprocessingDrawing" xmlns:wpg="http://schemas.microsoft.com/office/word/2010/wordprocessingGroup" xmlns:wpi="http://schemas.microsoft.com/office/word/2010/wordprocessingInk" xmlns:wps="http://schemas.microsoft.com/office/word/2010/wordprocessingShape" xmlns:o="urn:schemas-microsoft-com:office:office" xmlns:v="urn:schemas-microsoft-com:vml" xmlns:w10="urn:schemas-microsoft-com:office:word" xmlns:w="http://schemas.openxmlformats.org/wordprocessingml/2006/main" xmlns:w14="http://schemas.microsoft.com/office/word/2010/wordml" xmlns:w15="http://schemas.microsoft.com/office/word/2012/wordml" xmlns:w16cex="http://schemas.microsoft.com/office/word/2018/wordml/cex" xmlns:w16cid="http://schemas.microsoft.com/office/word/2016/wordml/cid" xmlns:w16="http://schemas.microsoft.com/office/word/2018/wordml" xmlns:w16sdtdh="http://schemas.microsoft.com/office/word/2020/wordml/sdtdatahash" xmlns:w16sdtfl="http://schemas.microsoft.com/office/word/2024/wordml/sdtformatlock" xmlns:w16se="http://schemas.microsoft.com/office/word/2015/wordml/symex" xmlns:w16du="http://schemas.microsoft.com/office/word/2023/wordml/word16du" xmlns:wne="http://schemas.microsoft.com/office/word/2006/wordml" mc:Ignorable="w14 w15 w16se w16cid w16 w16cex w16sdtdh w16sdtfl w16du wp14">
   <w:body>
     <w:p>
       <w:pPr>
@@ -136,7 +136,7 @@
                 <v:stroke joinstyle="miter"/>
                 <v:path gradientshapeok="t" o:connecttype="rect"/>
               </v:shapetype>
-              <v:shape id="Text Box 2" o:spid="_x0000_s1026" type="#_x0000_t202" style="position:absolute;margin-left:106.2pt;margin-top:40.7pt;width:307.8pt;height:74.7pt;z-index:251661312;visibility:visible;mso-wrap-style:square;mso-width-percent:0;mso-height-percent:200;mso-wrap-distance-left:9pt;mso-wrap-distance-top:3.6pt;mso-wrap-distance-right:9pt;mso-wrap-distance-bottom:3.6pt;mso-position-horizontal:absolute;mso-position-horizontal-relative:text;mso-position-vertical:absolute;mso-position-vertical-relative:text;mso-width-percent:0;mso-height-percent:200;mso-width-relative:margin;mso-height-relative:margin;v-text-anchor:top" o:gfxdata="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" stroked="f">
+              <v:shape id="Text Box 2" o:spid="_x0000_s1026" type="#_x0000_t202" style="position:absolute;margin-left:106.2pt;margin-top:40.7pt;width:307.8pt;height:74.7pt;z-index:251661312;visibility:visible;mso-wrap-style:square;mso-width-percent:0;mso-height-percent:200;mso-wrap-distance-left:9pt;mso-wrap-distance-top:3.6pt;mso-wrap-distance-right:9pt;mso-wrap-distance-bottom:3.6pt;mso-position-horizontal:absolute;mso-position-horizontal-relative:text;mso-position-vertical:absolute;mso-position-vertical-relative:text;mso-width-percent:0;mso-height-percent:200;mso-width-relative:margin;mso-height-relative:margin;v-text-anchor:top" o:gfxdata="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" stroked="f">
                 <v:textbox style="mso-fit-shape-to-text:t">
                   <w:txbxContent>
                     <w:p>
@@ -201,9 +201,17 @@
           <w:noProof/>
         </w:rPr>
         <w:drawing>
-          <wp:inline distT="0" distB="0" distL="0" distR="0" wp14:anchorId="4FA06F23" wp14:editId="58D46B54">
+          <wp:anchor distT="0" distB="0" distL="114300" distR="114300" simplePos="0" relativeHeight="251662336" behindDoc="1" locked="0" layoutInCell="1" allowOverlap="1" wp14:anchorId="429E9562" wp14:editId="004922B5">
+            <wp:simplePos x="0" y="0"/>
+            <wp:positionH relativeFrom="column">
+              <wp:posOffset>0</wp:posOffset>
+            </wp:positionH>
+            <wp:positionV relativeFrom="paragraph">
+              <wp:posOffset>3810</wp:posOffset>
+            </wp:positionV>
             <wp:extent cx="1381125" cy="1381125"/>
-            <wp:effectExtent l="0" t="0" r="0" b="0"/>
+            <wp:effectExtent l="0" t="0" r="3175" b="3175"/>
+            <wp:wrapNone/>
             <wp:docPr id="1" name="Picture 1"/>
             <wp:cNvGraphicFramePr>
               <a:graphicFrameLocks xmlns:a="http://schemas.openxmlformats.org/drawingml/2006/main" noChangeAspect="1"/>
@@ -239,7 +247,13 @@
                 </pic:pic>
               </a:graphicData>
             </a:graphic>
-          </wp:inline>
+            <wp14:sizeRelH relativeFrom="page">
+              <wp14:pctWidth>0</wp14:pctWidth>
+            </wp14:sizeRelH>
+            <wp14:sizeRelV relativeFrom="page">
+              <wp14:pctHeight>0</wp14:pctHeight>
+            </wp14:sizeRelV>
+          </wp:anchor>
         </w:drawing>
       </w:r>
     </w:p>
@@ -400,7 +414,21 @@
               <w:rPr>
                 <w:rFonts w:ascii="Calibri" w:hAnsi="Calibri"/>
               </w:rPr>
-              <w:t xml:space="preserve"> Sudarmo, Ardi</w:t>
+              <w:t xml:space="preserve"> </w:t>
+            </w:r>
+            <w:proofErr w:type="spellStart"/>
+            <w:r>
+              <w:rPr>
+                <w:rFonts w:ascii="Calibri" w:hAnsi="Calibri"/>
+              </w:rPr>
+              <w:t>Sudarmo</w:t>
+            </w:r>
+            <w:proofErr w:type="spellEnd"/>
+            <w:r>
+              <w:rPr>
+                <w:rFonts w:ascii="Calibri" w:hAnsi="Calibri"/>
+              </w:rPr>
+              <w:t>, Ardi</w:t>
             </w:r>
             <w:r>
               <w:rPr>
@@ -518,7 +546,7 @@
                 </mc:Choice>
                 <mc:Fallback>
                   <w:pict>
-                    <v:shape w14:anchorId="682658A5" id="Text Box 6" o:spid="_x0000_s1027" type="#_x0000_t202" style="position:absolute;margin-left:156.15pt;margin-top:10.05pt;width:84pt;height:30pt;z-index:251659264;visibility:visible;mso-wrap-style:square;mso-width-percent:0;mso-height-percent:0;mso-wrap-distance-left:9pt;mso-wrap-distance-top:0;mso-wrap-distance-right:9pt;mso-wrap-distance-bottom:0;mso-position-horizontal:absolute;mso-position-horizontal-relative:text;mso-position-vertical:absolute;mso-position-vertical-relative:text;mso-width-percent:0;mso-height-percent:0;mso-width-relative:page;mso-height-relative:page;v-text-anchor:top" o:gfxdata="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">
+                    <v:shape w14:anchorId="682658A5" id="Text Box 6" o:spid="_x0000_s1027" type="#_x0000_t202" style="position:absolute;margin-left:156.15pt;margin-top:10.05pt;width:84pt;height:30pt;z-index:251659264;visibility:visible;mso-wrap-style:square;mso-width-percent:0;mso-height-percent:0;mso-wrap-distance-left:9pt;mso-wrap-distance-top:0;mso-wrap-distance-right:9pt;mso-wrap-distance-bottom:0;mso-position-horizontal:absolute;mso-position-horizontal-relative:text;mso-position-vertical:absolute;mso-position-vertical-relative:text;mso-width-percent:0;mso-height-percent:0;mso-width-relative:page;mso-height-relative:page;v-text-anchor:top" o:gfxdata="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">
                       <v:textbox>
                         <w:txbxContent>
                           <w:p>
@@ -880,7 +908,67 @@
                 <w:sz w:val="16"/>
                 <w:szCs w:val="16"/>
               </w:rPr>
-              <w:t xml:space="preserve">except those parts duly identified and referenced in my submission. It complies with any specified word limits and the requirements and regulations detailed in the coursework instructions and any other relevant programme and module documentation. In submitting this work </w:t>
+              <w:t>except those parts duly identified and referenced in my submission</w:t>
+            </w:r>
+            <w:proofErr w:type="gramStart"/>
+            <w:r>
+              <w:rPr>
+                <w:rFonts w:ascii="Calibri" w:hAnsi="Calibri"/>
+                <w:color w:val="000000"/>
+                <w:sz w:val="16"/>
+                <w:szCs w:val="16"/>
+              </w:rPr>
+              <w:t xml:space="preserve">. </w:t>
+            </w:r>
+            <w:proofErr w:type="gramEnd"/>
+            <w:r>
+              <w:rPr>
+                <w:rFonts w:ascii="Calibri" w:hAnsi="Calibri"/>
+                <w:color w:val="000000"/>
+                <w:sz w:val="16"/>
+                <w:szCs w:val="16"/>
+              </w:rPr>
+              <w:t>It complies with any specified word limits and the requirements and regulations detailed in the coursework instructions and any other relevant programme and module documentation</w:t>
+            </w:r>
+            <w:proofErr w:type="gramStart"/>
+            <w:r>
+              <w:rPr>
+                <w:rFonts w:ascii="Calibri" w:hAnsi="Calibri"/>
+                <w:color w:val="000000"/>
+                <w:sz w:val="16"/>
+                <w:szCs w:val="16"/>
+              </w:rPr>
+              <w:t xml:space="preserve">. </w:t>
+            </w:r>
+            <w:proofErr w:type="gramEnd"/>
+            <w:r>
+              <w:rPr>
+                <w:rFonts w:ascii="Calibri" w:hAnsi="Calibri"/>
+                <w:color w:val="000000"/>
+                <w:sz w:val="16"/>
+                <w:szCs w:val="16"/>
+              </w:rPr>
+              <w:t xml:space="preserve">In submitting this </w:t>
+            </w:r>
+            <w:proofErr w:type="gramStart"/>
+            <w:r>
+              <w:rPr>
+                <w:rFonts w:ascii="Calibri" w:hAnsi="Calibri"/>
+                <w:color w:val="000000"/>
+                <w:sz w:val="16"/>
+                <w:szCs w:val="16"/>
+              </w:rPr>
+              <w:t>work</w:t>
+            </w:r>
+            <w:proofErr w:type="gramEnd"/>
+            <w:r>
+              <w:rPr>
+                <w:rFonts w:ascii="Calibri" w:hAnsi="Calibri"/>
+                <w:color w:val="000000"/>
+                <w:sz w:val="16"/>
+                <w:szCs w:val="16"/>
+              </w:rPr>
+              <w:t xml:space="preserve"> </w:t>
             </w:r>
             <w:r>
               <w:rPr>
@@ -916,8 +1004,19 @@
                 <w:sz w:val="16"/>
                 <w:szCs w:val="16"/>
               </w:rPr>
-              <w:t xml:space="preserve"> have read and understood the regulations and code regarding academic misconduct, including that relating to plagiarism, as specified in the Programme Handbook. </w:t>
-            </w:r>
+              <w:t xml:space="preserve"> have read and understood the regulations and code regarding academic misconduct, including that relating to plagiarism, as specified in the Programme Handbook</w:t>
+            </w:r>
+            <w:proofErr w:type="gramStart"/>
+            <w:r>
+              <w:rPr>
+                <w:rFonts w:ascii="Calibri" w:hAnsi="Calibri"/>
+                <w:color w:val="000000"/>
+                <w:sz w:val="16"/>
+                <w:szCs w:val="16"/>
+              </w:rPr>
+              <w:t xml:space="preserve">. </w:t>
+            </w:r>
+            <w:proofErr w:type="gramEnd"/>
             <w:r>
               <w:rPr>
                 <w:rFonts w:ascii="Calibri" w:hAnsi="Calibri"/>
@@ -934,8 +1033,19 @@
                 <w:sz w:val="16"/>
                 <w:szCs w:val="16"/>
               </w:rPr>
-              <w:t xml:space="preserve"> also acknowledge that this work will be subject to a variety of checks for academic misconduct. </w:t>
-            </w:r>
+              <w:t xml:space="preserve"> also acknowledge that this work will be subject to a variety of checks for academic misconduct</w:t>
+            </w:r>
+            <w:proofErr w:type="gramStart"/>
+            <w:r>
+              <w:rPr>
+                <w:rFonts w:ascii="Calibri" w:hAnsi="Calibri"/>
+                <w:color w:val="000000"/>
+                <w:sz w:val="16"/>
+                <w:szCs w:val="16"/>
+              </w:rPr>
+              <w:t xml:space="preserve">. </w:t>
+            </w:r>
+            <w:proofErr w:type="gramEnd"/>
             <w:r>
               <w:rPr>
                 <w:rFonts w:ascii="Calibri" w:hAnsi="Calibri"/>
@@ -968,7 +1078,27 @@
                 <w:sz w:val="16"/>
                 <w:szCs w:val="16"/>
               </w:rPr>
-              <w:t xml:space="preserve">work submitted late without a granted extension will be subject to penalties, as outlined in the Programme Handbook. Penalties will </w:t>
+              <w:t>work submitted late without a granted extension will be subject to penalties, as outlined in the Programme Handbook</w:t>
+            </w:r>
+            <w:proofErr w:type="gramStart"/>
+            <w:r>
+              <w:rPr>
+                <w:rFonts w:ascii="Calibri" w:hAnsi="Calibri"/>
+                <w:color w:val="000000"/>
+                <w:sz w:val="16"/>
+                <w:szCs w:val="16"/>
+              </w:rPr>
+              <w:t xml:space="preserve">. </w:t>
+            </w:r>
+            <w:proofErr w:type="gramEnd"/>
+            <w:r>
+              <w:rPr>
+                <w:rFonts w:ascii="Calibri" w:hAnsi="Calibri"/>
+                <w:color w:val="000000"/>
+                <w:sz w:val="16"/>
+                <w:szCs w:val="16"/>
+              </w:rPr>
+              <w:t xml:space="preserve">Penalties will </w:t>
             </w:r>
             <w:r>
               <w:rPr>
@@ -1250,7 +1380,7 @@
           </mc:Choice>
           <mc:Fallback>
             <w:pict>
-              <v:shape w14:anchorId="222397B2" id="Text Box 3" o:spid="_x0000_s1028" type="#_x0000_t202" style="position:absolute;margin-left:414pt;margin-top:4pt;width:81pt;height:38.45pt;z-index:251657216;visibility:visible;mso-wrap-style:square;mso-width-percent:0;mso-height-percent:0;mso-wrap-distance-left:9pt;mso-wrap-distance-top:0;mso-wrap-distance-right:9pt;mso-wrap-distance-bottom:0;mso-position-horizontal:absolute;mso-position-horizontal-relative:text;mso-position-vertical:absolute;mso-position-vertical-relative:text;mso-width-percent:0;mso-height-percent:0;mso-width-relative:page;mso-height-relative:page;v-text-anchor:top" o:gfxdata="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">
+              <v:shape w14:anchorId="222397B2" id="Text Box 3" o:spid="_x0000_s1028" type="#_x0000_t202" style="position:absolute;margin-left:414pt;margin-top:4pt;width:81pt;height:38.45pt;z-index:251657216;visibility:visible;mso-wrap-style:square;mso-width-percent:0;mso-height-percent:0;mso-wrap-distance-left:9pt;mso-wrap-distance-top:0;mso-wrap-distance-right:9pt;mso-wrap-distance-bottom:0;mso-position-horizontal:absolute;mso-position-horizontal-relative:text;mso-position-vertical:absolute;mso-position-vertical-relative:text;mso-width-percent:0;mso-height-percent:0;mso-width-relative:page;mso-height-relative:page;v-text-anchor:top" o:gfxdata="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">
                 <v:textbox>
                   <w:txbxContent>
                     <w:p>
@@ -1361,7 +1491,7 @@
           </mc:Choice>
           <mc:Fallback>
             <w:pict>
-              <v:shape w14:anchorId="4A7F54C4" id="Text Box 4" o:spid="_x0000_s1029" type="#_x0000_t202" style="position:absolute;margin-left:178.35pt;margin-top:4pt;width:82.65pt;height:38.45pt;z-index:251658240;visibility:visible;mso-wrap-style:square;mso-width-percent:0;mso-height-percent:0;mso-wrap-distance-left:9pt;mso-wrap-distance-top:0;mso-wrap-distance-right:9pt;mso-wrap-distance-bottom:0;mso-position-horizontal:absolute;mso-position-horizontal-relative:text;mso-position-vertical:absolute;mso-position-vertical-relative:text;mso-width-percent:0;mso-height-percent:0;mso-width-relative:page;mso-height-relative:page;v-text-anchor:top" o:gfxdata="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">
+              <v:shape w14:anchorId="4A7F54C4" id="Text Box 4" o:spid="_x0000_s1029" type="#_x0000_t202" style="position:absolute;margin-left:178.35pt;margin-top:4pt;width:82.65pt;height:38.45pt;z-index:251658240;visibility:visible;mso-wrap-style:square;mso-width-percent:0;mso-height-percent:0;mso-wrap-distance-left:9pt;mso-wrap-distance-top:0;mso-wrap-distance-right:9pt;mso-wrap-distance-bottom:0;mso-position-horizontal:absolute;mso-position-horizontal-relative:text;mso-position-vertical:absolute;mso-position-vertical-relative:text;mso-width-percent:0;mso-height-percent:0;mso-width-relative:page;mso-height-relative:page;v-text-anchor:top" o:gfxdata="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">
                 <v:textbox>
                   <w:txbxContent>
                     <w:p/>
@@ -1505,7 +1635,7 @@
 </file>
 
 <file path=word/endnotes.xml><?xml version="1.0" encoding="utf-8"?>
-<w:endnotes xmlns:wpc="http://schemas.microsoft.com/office/word/2010/wordprocessingCanvas" xmlns:cx="http://schemas.microsoft.com/office/drawing/2014/chartex" xmlns:cx1="http://schemas.microsoft.com/office/drawing/2015/9/8/chartex" xmlns:cx2="http://schemas.microsoft.com/office/drawing/2015/10/21/chartex" xmlns:cx3="http://schemas.microsoft.com/office/drawing/2016/5/9/chartex" xmlns:cx4="http://schemas.microsoft.com/office/drawing/2016/5/10/chartex" xmlns:cx5="http://schemas.microsoft.com/office/drawing/2016/5/11/chartex" xmlns:cx6="http://schemas.microsoft.com/office/drawing/2016/5/12/chartex" xmlns:cx7="http://schemas.microsoft.com/office/drawing/2016/5/13/chartex" xmlns:cx8="http://schemas.microsoft.com/office/drawing/2016/5/14/chartex" xmlns:mc="http://schemas.openxmlformats.org/markup-compatibility/2006" xmlns:aink="http://schemas.microsoft.com/office/drawing/2016/ink" xmlns:am3d="http://schemas.microsoft.com/office/drawing/2017/model3d" xmlns:o="urn:schemas-microsoft-com:office:office" xmlns:oel="http://schemas.microsoft.com/office/2019/extlst" xmlns:r="http://schemas.openxmlformats.org/officeDocument/2006/relationships" xmlns:m="http://schemas.openxmlformats.org/officeDocument/2006/math" xmlns:v="urn:schemas-microsoft-com:vml" xmlns:wp14="http://schemas.microsoft.com/office/word/2010/wordprocessingDrawing" xmlns:wp="http://schemas.openxmlformats.org/drawingml/2006/wordprocessingDrawing" xmlns:w10="urn:schemas-microsoft-com:office:word" xmlns:w="http://schemas.openxmlformats.org/wordprocessingml/2006/main" xmlns:w14="http://schemas.microsoft.com/office/word/2010/wordml" xmlns:w15="http://schemas.microsoft.com/office/word/2012/wordml" xmlns:w16cex="http://schemas.microsoft.com/office/word/2018/wordml/cex" xmlns:w16cid="http://schemas.microsoft.com/office/word/2016/wordml/cid" xmlns:w16="http://schemas.microsoft.com/office/word/2018/wordml" xmlns:w16du="http://schemas.microsoft.com/office/word/2023/wordml/word16du" xmlns:w16sdtdh="http://schemas.microsoft.com/office/word/2020/wordml/sdtdatahash" xmlns:w16sdtfl="http://schemas.microsoft.com/office/word/2024/wordml/sdtformatlock" xmlns:w16se="http://schemas.microsoft.com/office/word/2015/wordml/symex" xmlns:wpg="http://schemas.microsoft.com/office/word/2010/wordprocessingGroup" xmlns:wpi="http://schemas.microsoft.com/office/word/2010/wordprocessingInk" xmlns:wne="http://schemas.microsoft.com/office/word/2006/wordml" xmlns:wps="http://schemas.microsoft.com/office/word/2010/wordprocessingShape" mc:Ignorable="w14 w15 w16se w16cid w16 w16cex w16sdtdh w16sdtfl w16du wp14">
+<w:endnotes xmlns:wpc="http://schemas.microsoft.com/office/word/2010/wordprocessingCanvas" xmlns:cx="http://schemas.microsoft.com/office/drawing/2014/chartex" xmlns:cx1="http://schemas.microsoft.com/office/drawing/2015/9/8/chartex" xmlns:cx2="http://schemas.microsoft.com/office/drawing/2015/10/21/chartex" xmlns:cx3="http://schemas.microsoft.com/office/drawing/2016/5/9/chartex" xmlns:cx4="http://schemas.microsoft.com/office/drawing/2016/5/10/chartex" xmlns:cx5="http://schemas.microsoft.com/office/drawing/2016/5/11/chartex" xmlns:cx6="http://schemas.microsoft.com/office/drawing/2016/5/12/chartex" xmlns:cx7="http://schemas.microsoft.com/office/drawing/2016/5/13/chartex" xmlns:cx8="http://schemas.microsoft.com/office/drawing/2016/5/14/chartex" xmlns:mc="http://schemas.openxmlformats.org/markup-compatibility/2006" xmlns:m="http://schemas.openxmlformats.org/officeDocument/2006/math" xmlns:aink="http://schemas.microsoft.com/office/drawing/2016/ink" xmlns:am3d="http://schemas.microsoft.com/office/drawing/2017/model3d" xmlns:oel="http://schemas.microsoft.com/office/2019/extlst" xmlns:r="http://schemas.openxmlformats.org/officeDocument/2006/relationships" xmlns:wp14="http://schemas.microsoft.com/office/word/2010/wordprocessingDrawing" xmlns:wp="http://schemas.openxmlformats.org/drawingml/2006/wordprocessingDrawing" xmlns:wpg="http://schemas.microsoft.com/office/word/2010/wordprocessingGroup" xmlns:wpi="http://schemas.microsoft.com/office/word/2010/wordprocessingInk" xmlns:wps="http://schemas.microsoft.com/office/word/2010/wordprocessingShape" xmlns:o="urn:schemas-microsoft-com:office:office" xmlns:v="urn:schemas-microsoft-com:vml" xmlns:w10="urn:schemas-microsoft-com:office:word" xmlns:w="http://schemas.openxmlformats.org/wordprocessingml/2006/main" xmlns:w14="http://schemas.microsoft.com/office/word/2010/wordml" xmlns:w15="http://schemas.microsoft.com/office/word/2012/wordml" xmlns:w16cex="http://schemas.microsoft.com/office/word/2018/wordml/cex" xmlns:w16cid="http://schemas.microsoft.com/office/word/2016/wordml/cid" xmlns:w16="http://schemas.microsoft.com/office/word/2018/wordml" xmlns:w16sdtdh="http://schemas.microsoft.com/office/word/2020/wordml/sdtdatahash" xmlns:w16sdtfl="http://schemas.microsoft.com/office/word/2024/wordml/sdtformatlock" xmlns:w16se="http://schemas.microsoft.com/office/word/2015/wordml/symex" xmlns:w16du="http://schemas.microsoft.com/office/word/2023/wordml/word16du" xmlns:wne="http://schemas.microsoft.com/office/word/2006/wordml" mc:Ignorable="w14 w15 w16se w16cid w16 w16cex w16sdtdh w16sdtfl w16du wp14">
   <w:endnote w:type="separator" w:id="-1">
     <w:p>
       <w:r>
@@ -1524,7 +1654,7 @@
 </file>
 
 <file path=word/footnotes.xml><?xml version="1.0" encoding="utf-8"?>
-<w:footnotes xmlns:wpc="http://schemas.microsoft.com/office/word/2010/wordprocessingCanvas" xmlns:cx="http://schemas.microsoft.com/office/drawing/2014/chartex" xmlns:cx1="http://schemas.microsoft.com/office/drawing/2015/9/8/chartex" xmlns:cx2="http://schemas.microsoft.com/office/drawing/2015/10/21/chartex" xmlns:cx3="http://schemas.microsoft.com/office/drawing/2016/5/9/chartex" xmlns:cx4="http://schemas.microsoft.com/office/drawing/2016/5/10/chartex" xmlns:cx5="http://schemas.microsoft.com/office/drawing/2016/5/11/chartex" xmlns:cx6="http://schemas.microsoft.com/office/drawing/2016/5/12/chartex" xmlns:cx7="http://schemas.microsoft.com/office/drawing/2016/5/13/chartex" xmlns:cx8="http://schemas.microsoft.com/office/drawing/2016/5/14/chartex" xmlns:mc="http://schemas.openxmlformats.org/markup-compatibility/2006" xmlns:aink="http://schemas.microsoft.com/office/drawing/2016/ink" xmlns:am3d="http://schemas.microsoft.com/office/drawing/2017/model3d" xmlns:o="urn:schemas-microsoft-com:office:office" xmlns:oel="http://schemas.microsoft.com/office/2019/extlst" xmlns:r="http://schemas.openxmlformats.org/officeDocument/2006/relationships" xmlns:m="http://schemas.openxmlformats.org/officeDocument/2006/math" xmlns:v="urn:schemas-microsoft-com:vml" xmlns:wp14="http://schemas.microsoft.com/office/word/2010/wordprocessingDrawing" xmlns:wp="http://schemas.openxmlformats.org/drawingml/2006/wordprocessingDrawing" xmlns:w10="urn:schemas-microsoft-com:office:word" xmlns:w="http://schemas.openxmlformats.org/wordprocessingml/2006/main" xmlns:w14="http://schemas.microsoft.com/office/word/2010/wordml" xmlns:w15="http://schemas.microsoft.com/office/word/2012/wordml" xmlns:w16cex="http://schemas.microsoft.com/office/word/2018/wordml/cex" xmlns:w16cid="http://schemas.microsoft.com/office/word/2016/wordml/cid" xmlns:w16="http://schemas.microsoft.com/office/word/2018/wordml" xmlns:w16du="http://schemas.microsoft.com/office/word/2023/wordml/word16du" xmlns:w16sdtdh="http://schemas.microsoft.com/office/word/2020/wordml/sdtdatahash" xmlns:w16sdtfl="http://schemas.microsoft.com/office/word/2024/wordml/sdtformatlock" xmlns:w16se="http://schemas.microsoft.com/office/word/2015/wordml/symex" xmlns:wpg="http://schemas.microsoft.com/office/word/2010/wordprocessingGroup" xmlns:wpi="http://schemas.microsoft.com/office/word/2010/wordprocessingInk" xmlns:wne="http://schemas.microsoft.com/office/word/2006/wordml" xmlns:wps="http://schemas.microsoft.com/office/word/2010/wordprocessingShape" mc:Ignorable="w14 w15 w16se w16cid w16 w16cex w16sdtdh w16sdtfl w16du wp14">
+<w:footnotes xmlns:wpc="http://schemas.microsoft.com/office/word/2010/wordprocessingCanvas" xmlns:cx="http://schemas.microsoft.com/office/drawing/2014/chartex" xmlns:cx1="http://schemas.microsoft.com/office/drawing/2015/9/8/chartex" xmlns:cx2="http://schemas.microsoft.com/office/drawing/2015/10/21/chartex" xmlns:cx3="http://schemas.microsoft.com/office/drawing/2016/5/9/chartex" xmlns:cx4="http://schemas.microsoft.com/office/drawing/2016/5/10/chartex" xmlns:cx5="http://schemas.microsoft.com/office/drawing/2016/5/11/chartex" xmlns:cx6="http://schemas.microsoft.com/office/drawing/2016/5/12/chartex" xmlns:cx7="http://schemas.microsoft.com/office/drawing/2016/5/13/chartex" xmlns:cx8="http://schemas.microsoft.com/office/drawing/2016/5/14/chartex" xmlns:mc="http://schemas.openxmlformats.org/markup-compatibility/2006" xmlns:m="http://schemas.openxmlformats.org/officeDocument/2006/math" xmlns:aink="http://schemas.microsoft.com/office/drawing/2016/ink" xmlns:am3d="http://schemas.microsoft.com/office/drawing/2017/model3d" xmlns:oel="http://schemas.microsoft.com/office/2019/extlst" xmlns:r="http://schemas.openxmlformats.org/officeDocument/2006/relationships" xmlns:wp14="http://schemas.microsoft.com/office/word/2010/wordprocessingDrawing" xmlns:wp="http://schemas.openxmlformats.org/drawingml/2006/wordprocessingDrawing" xmlns:wpg="http://schemas.microsoft.com/office/word/2010/wordprocessingGroup" xmlns:wpi="http://schemas.microsoft.com/office/word/2010/wordprocessingInk" xmlns:wps="http://schemas.microsoft.com/office/word/2010/wordprocessingShape" xmlns:o="urn:schemas-microsoft-com:office:office" xmlns:v="urn:schemas-microsoft-com:vml" xmlns:w10="urn:schemas-microsoft-com:office:word" xmlns:w="http://schemas.openxmlformats.org/wordprocessingml/2006/main" xmlns:w14="http://schemas.microsoft.com/office/word/2010/wordml" xmlns:w15="http://schemas.microsoft.com/office/word/2012/wordml" xmlns:w16cex="http://schemas.microsoft.com/office/word/2018/wordml/cex" xmlns:w16cid="http://schemas.microsoft.com/office/word/2016/wordml/cid" xmlns:w16="http://schemas.microsoft.com/office/word/2018/wordml" xmlns:w16sdtdh="http://schemas.microsoft.com/office/word/2020/wordml/sdtdatahash" xmlns:w16sdtfl="http://schemas.microsoft.com/office/word/2024/wordml/sdtformatlock" xmlns:w16se="http://schemas.microsoft.com/office/word/2015/wordml/symex" xmlns:w16du="http://schemas.microsoft.com/office/word/2023/wordml/word16du" xmlns:wne="http://schemas.microsoft.com/office/word/2006/wordml" mc:Ignorable="w14 w15 w16se w16cid w16 w16cex w16sdtdh w16sdtfl w16du wp14">
   <w:footnote w:type="separator" w:id="-1">
     <w:p>
       <w:r>
@@ -1543,7 +1673,7 @@
 </file>
 
 <file path=word/styles.xml><?xml version="1.0" encoding="utf-8"?>
-<w:styles xmlns:mc="http://schemas.openxmlformats.org/markup-compatibility/2006" xmlns:r="http://schemas.openxmlformats.org/officeDocument/2006/relationships" xmlns:w="http://schemas.openxmlformats.org/wordprocessingml/2006/main" xmlns:w14="http://schemas.microsoft.com/office/word/2010/wordml" xmlns:w15="http://schemas.microsoft.com/office/word/2012/wordml" xmlns:w16cex="http://schemas.microsoft.com/office/word/2018/wordml/cex" xmlns:w16cid="http://schemas.microsoft.com/office/word/2016/wordml/cid" xmlns:w16="http://schemas.microsoft.com/office/word/2018/wordml" xmlns:w16du="http://schemas.microsoft.com/office/word/2023/wordml/word16du" xmlns:w16sdtdh="http://schemas.microsoft.com/office/word/2020/wordml/sdtdatahash" xmlns:w16sdtfl="http://schemas.microsoft.com/office/word/2024/wordml/sdtformatlock" xmlns:w16se="http://schemas.microsoft.com/office/word/2015/wordml/symex" mc:Ignorable="w14 w15 w16se w16cid w16 w16cex w16sdtdh w16sdtfl w16du">
+<w:styles xmlns:mc="http://schemas.openxmlformats.org/markup-compatibility/2006" xmlns:r="http://schemas.openxmlformats.org/officeDocument/2006/relationships" xmlns:w="http://schemas.openxmlformats.org/wordprocessingml/2006/main" xmlns:w14="http://schemas.microsoft.com/office/word/2010/wordml" xmlns:w15="http://schemas.microsoft.com/office/word/2012/wordml" xmlns:w16cex="http://schemas.microsoft.com/office/word/2018/wordml/cex" xmlns:w16cid="http://schemas.microsoft.com/office/word/2016/wordml/cid" xmlns:w16="http://schemas.microsoft.com/office/word/2018/wordml" xmlns:w16sdtdh="http://schemas.microsoft.com/office/word/2020/wordml/sdtdatahash" xmlns:w16sdtfl="http://schemas.microsoft.com/office/word/2024/wordml/sdtformatlock" xmlns:w16se="http://schemas.microsoft.com/office/word/2015/wordml/symex" xmlns:w16du="http://schemas.microsoft.com/office/word/2023/wordml/word16du" mc:Ignorable="w14 w15 w16se w16cid w16 w16cex w16sdtdh w16sdtfl w16du">
   <w:docDefaults>
     <w:rPrDefault>
       <w:rPr>

</xml_diff>